<commit_message>
Bjergarternes densitet: klassens gennemsnit i stedet for afvigelse
Beregningen af afvigelse fra tabelværdien er taget ud. I stedet samler
eleverne hele klassens densiteter i et nyt skema og regner gennemsnittet
for hver bjergart. Det gennemsnit bruges i rækkefølgen og i snittet A–D,
og et nyt journalspørgsmål handler om spredningen mellem grupperne.
Materialelisten siger nu bare «En præcis vægt».

Co-Authored-By: Claude Opus 5.5 <noreply@anthropic.com>
Claude-Session: https://claude.ai/code/session_01Ja6yFAcYLHoA1jGLNAmwgK
</commit_message>
<xml_diff>
--- a/Øvelser/Geografi/bjergarters-densitet/bjergarters-densitet.docx
+++ b/Øvelser/Geografi/bjergarters-densitet/bjergarters-densitet.docx
@@ -516,7 +516,7 @@
               </w:numPr>
             </w:pPr>
             <w:r>
-              <w:t xml:space="preserve">Digital vægt med tarafunktion, der kan veje op til ca. 2 kg</w:t>
+              <w:t xml:space="preserve">En præcis vægt</w:t>
             </w:r>
           </w:p>
           <w:p>
@@ -1136,7 +1136,7 @@
       </w:tr>
     </w:tbl>
     <w:bookmarkEnd w:id="35"/>
-    <w:bookmarkStart w:id="43" w:name="databehandling"/>
+    <w:bookmarkStart w:id="44" w:name="databehandling"/>
     <w:p>
       <w:pPr>
         <w:pStyle w:val="Heading2"/>
@@ -1319,138 +1319,6 @@
         </m:oMath>
       </m:oMathPara>
     </w:p>
-    <w:p>
-      <w:pPr>
-        <w:pStyle w:val="Compact"/>
-        <w:numPr>
-          <w:ilvl w:val="0"/>
-          <w:numId w:val="1006"/>
-        </w:numPr>
-      </w:pPr>
-      <w:r>
-        <w:t xml:space="preserve">Sammenlign med tabelværdien i</w:t>
-      </w:r>
-      <w:r>
-        <w:t xml:space="preserve"> </w:t>
-      </w:r>
-      <w:hyperlink w:anchor="tbl-2">
-        <w:r>
-          <w:rPr>
-            <w:rStyle w:val="Hyperlink"/>
-          </w:rPr>
-          <w:t xml:space="preserve">Tabel 2</w:t>
-        </w:r>
-      </w:hyperlink>
-      <w:r>
-        <w:t xml:space="preserve">, og beregn afvigelsen i procent. Brug midten af intervallet som tabelværdi:</w:t>
-      </w:r>
-    </w:p>
-    <w:p>
-      <w:pPr>
-        <w:pStyle w:val="FirstParagraph"/>
-      </w:pPr>
-      <m:oMathPara>
-        <m:oMathParaPr>
-          <m:jc m:val="center"/>
-        </m:oMathParaPr>
-        <m:oMath>
-          <m:r>
-            <m:rPr>
-              <m:nor/>
-              <m:sty m:val="p"/>
-            </m:rPr>
-            <m:t>afvigelse</m:t>
-          </m:r>
-          <m:r>
-            <m:rPr>
-              <m:sty m:val="p"/>
-            </m:rPr>
-            <m:t>=</m:t>
-          </m:r>
-          <m:f>
-            <m:fPr>
-              <m:type m:val="bar"/>
-            </m:fPr>
-            <m:num>
-              <m:sSub>
-                <m:e>
-                  <m:r>
-                    <m:t>ρ</m:t>
-                  </m:r>
-                </m:e>
-                <m:sub>
-                  <m:r>
-                    <m:rPr>
-                      <m:nor/>
-                      <m:sty m:val="p"/>
-                    </m:rPr>
-                    <m:t>målt</m:t>
-                  </m:r>
-                </m:sub>
-              </m:sSub>
-              <m:r>
-                <m:rPr>
-                  <m:sty m:val="p"/>
-                </m:rPr>
-                <m:t>−</m:t>
-              </m:r>
-              <m:sSub>
-                <m:e>
-                  <m:r>
-                    <m:t>ρ</m:t>
-                  </m:r>
-                </m:e>
-                <m:sub>
-                  <m:r>
-                    <m:rPr>
-                      <m:nor/>
-                      <m:sty m:val="p"/>
-                    </m:rPr>
-                    <m:t>tabel</m:t>
-                  </m:r>
-                </m:sub>
-              </m:sSub>
-            </m:num>
-            <m:den>
-              <m:sSub>
-                <m:e>
-                  <m:r>
-                    <m:t>ρ</m:t>
-                  </m:r>
-                </m:e>
-                <m:sub>
-                  <m:r>
-                    <m:rPr>
-                      <m:nor/>
-                      <m:sty m:val="p"/>
-                    </m:rPr>
-                    <m:t>tabel</m:t>
-                  </m:r>
-                </m:sub>
-              </m:sSub>
-            </m:den>
-          </m:f>
-          <m:r>
-            <m:rPr>
-              <m:sty m:val="p"/>
-            </m:rPr>
-            <m:t>⋅</m:t>
-          </m:r>
-          <m:r>
-            <m:t>100</m:t>
-          </m:r>
-          <m:r>
-            <m:t> </m:t>
-          </m:r>
-          <m:r>
-            <m:rPr>
-              <m:sty m:val="p"/>
-            </m:rPr>
-            <m:t>%</m:t>
-          </m:r>
-        </m:oMath>
-      </m:oMathPara>
-    </w:p>
     <w:tbl>
       <w:tblPr>
         <w:tblStyle w:val="Table"/>
@@ -1475,22 +1343,19 @@
               <w:pStyle w:val="ImageCaption"/>
             </w:pPr>
             <w:r>
-              <w:t xml:space="preserve">Tabel 2: Beregnede værdier og sammenligning med typiske tabelværdier.</w:t>
+              <w:t xml:space="preserve">Tabel 2: Jeres gruppes beregnede rumfang og densitet.</w:t>
             </w:r>
           </w:p>
           <w:tbl>
             <w:tblPr>
               <w:tblStyle w:val="Table"/>
-              <w:tblW w:type="pct" w:w="5000"/>
-              <w:tblLayout w:type="fixed"/>
+              <w:tblW w:type="auto" w:w="0"/>
               <w:tblLook w:firstRow="1" w:lastRow="0" w:firstColumn="0" w:lastColumn="0" w:noHBand="0" w:noVBand="0" w:val="0020"/>
             </w:tblPr>
             <w:tblGrid>
-              <w:gridCol w:w="1980"/>
-              <w:gridCol w:w="1485"/>
-              <w:gridCol w:w="1485"/>
-              <w:gridCol w:w="1485"/>
-              <w:gridCol w:w="1485"/>
+              <w:gridCol w:w="2640"/>
+              <w:gridCol w:w="2640"/>
+              <w:gridCol w:w="2640"/>
             </w:tblGrid>
             <w:tr>
               <w:trPr>
@@ -1535,35 +1400,7 @@
                     <w:jc w:val="center"/>
                   </w:pPr>
                   <w:r>
-                    <w:t xml:space="preserve">Målt densitet (g/cm³)</w:t>
-                  </w:r>
-                </w:p>
-              </w:tc>
-              <w:tc>
-                <w:tcPr/>
-                <w:p>
-                  <w:pPr>
-                    <w:pStyle w:val="Compact"/>
-                    <w:keepNext/>
-                    <w:jc w:val="center"/>
-                    <w:jc w:val="center"/>
-                  </w:pPr>
-                  <w:r>
-                    <w:t xml:space="preserve">Tabelværdi (g/cm³)</w:t>
-                  </w:r>
-                </w:p>
-              </w:tc>
-              <w:tc>
-                <w:tcPr/>
-                <w:p>
-                  <w:pPr>
-                    <w:pStyle w:val="Compact"/>
-                    <w:keepNext/>
-                    <w:jc w:val="center"/>
-                    <w:jc w:val="center"/>
-                  </w:pPr>
-                  <w:r>
-                    <w:t xml:space="preserve">Afvigelse (%)</w:t>
+                    <w:t xml:space="preserve">Densitet (g/cm³)</w:t>
                   </w:r>
                 </w:p>
               </w:tc>
@@ -1604,29 +1441,6 @@
                   </w:pPr>
                 </w:p>
               </w:tc>
-              <w:tc>
-                <w:tcPr/>
-                <w:p>
-                  <w:pPr>
-                    <w:pStyle w:val="Compact"/>
-                    <w:keepNext/>
-                    <w:jc w:val="center"/>
-                    <w:jc w:val="center"/>
-                  </w:pPr>
-                  <w:r>
-                    <w:t xml:space="preserve">2,6–2,7</w:t>
-                  </w:r>
-                </w:p>
-              </w:tc>
-              <w:tc>
-                <w:tcPr/>
-                <w:p>
-                  <w:pPr>
-                    <w:pStyle w:val="Compact"/>
-                    <w:keepNext/>
-                  </w:pPr>
-                </w:p>
-              </w:tc>
             </w:tr>
             <w:tr>
               <w:trPr>
@@ -1664,29 +1478,6 @@
                   </w:pPr>
                 </w:p>
               </w:tc>
-              <w:tc>
-                <w:tcPr/>
-                <w:p>
-                  <w:pPr>
-                    <w:pStyle w:val="Compact"/>
-                    <w:keepNext/>
-                    <w:jc w:val="center"/>
-                    <w:jc w:val="center"/>
-                  </w:pPr>
-                  <w:r>
-                    <w:t xml:space="preserve">2,9–3,0</w:t>
-                  </w:r>
-                </w:p>
-              </w:tc>
-              <w:tc>
-                <w:tcPr/>
-                <w:p>
-                  <w:pPr>
-                    <w:pStyle w:val="Compact"/>
-                    <w:keepNext/>
-                  </w:pPr>
-                </w:p>
-              </w:tc>
             </w:tr>
             <w:tr>
               <w:trPr>
@@ -1724,29 +1515,6 @@
                   </w:pPr>
                 </w:p>
               </w:tc>
-              <w:tc>
-                <w:tcPr/>
-                <w:p>
-                  <w:pPr>
-                    <w:pStyle w:val="Compact"/>
-                    <w:keepNext/>
-                    <w:jc w:val="center"/>
-                    <w:jc w:val="center"/>
-                  </w:pPr>
-                  <w:r>
-                    <w:t xml:space="preserve">3,2–3,4</w:t>
-                  </w:r>
-                </w:p>
-              </w:tc>
-              <w:tc>
-                <w:tcPr/>
-                <w:p>
-                  <w:pPr>
-                    <w:pStyle w:val="Compact"/>
-                    <w:keepNext/>
-                  </w:pPr>
-                </w:p>
-              </w:tc>
             </w:tr>
             <w:tr>
               <w:trPr>
@@ -1771,27 +1539,6 @@
                   <w:pPr>
                     <w:pStyle w:val="Compact"/>
                   </w:pPr>
-                </w:p>
-              </w:tc>
-              <w:tc>
-                <w:tcPr/>
-                <w:p>
-                  <w:pPr>
-                    <w:pStyle w:val="Compact"/>
-                  </w:pPr>
-                </w:p>
-              </w:tc>
-              <w:tc>
-                <w:tcPr/>
-                <w:p>
-                  <w:pPr>
-                    <w:pStyle w:val="Compact"/>
-                    <w:jc w:val="center"/>
-                    <w:jc w:val="center"/>
-                  </w:pPr>
-                  <w:r>
-                    <w:t xml:space="preserve">3,4–3,6</w:t>
-                  </w:r>
                 </w:p>
               </w:tc>
               <w:tc>
@@ -1814,34 +1561,11 @@
         <w:pStyle w:val="Compact"/>
         <w:numPr>
           <w:ilvl w:val="0"/>
-          <w:numId w:val="1007"/>
+          <w:numId w:val="1006"/>
         </w:numPr>
       </w:pPr>
       <w:r>
-        <w:t xml:space="preserve">Sæt de fire bjergarter i rækkefølge efter jeres målte densitet, og sammenlign med jeres hypotese.</w:t>
-      </w:r>
-    </w:p>
-    <w:p>
-      <w:pPr>
-        <w:pStyle w:val="Compact"/>
-        <w:numPr>
-          <w:ilvl w:val="0"/>
-          <w:numId w:val="1007"/>
-        </w:numPr>
-      </w:pPr>
-      <w:hyperlink w:anchor="fig-profil">
-        <w:r>
-          <w:rPr>
-            <w:rStyle w:val="Hyperlink"/>
-          </w:rPr>
-          <w:t xml:space="preserve">Figur 2</w:t>
-        </w:r>
-      </w:hyperlink>
-      <w:r>
-        <w:t xml:space="preserve"> </w:t>
-      </w:r>
-      <w:r>
-        <w:t xml:space="preserve">viser et snit fra en midtoceanisk ryg til et kontinent. Find ud af, hvilken bjergart der hører til i hvert af felterne A–D, og udfyld</w:t>
+        <w:t xml:space="preserve">Skriv jeres densiteter op på tavlen sammen med de andre gruppers, og saml hele klassens resultater i</w:t>
       </w:r>
       <w:r>
         <w:t xml:space="preserve"> </w:t>
@@ -1855,8 +1579,122 @@
         </w:r>
       </w:hyperlink>
       <w:r>
-        <w:t xml:space="preserve">.</w:t>
-      </w:r>
+        <w:t xml:space="preserve">. Beregn gennemsnittet for hver bjergart, hvor</w:t>
+      </w:r>
+      <w:r>
+        <w:t xml:space="preserve"> </w:t>
+      </w:r>
+      <m:oMath>
+        <m:r>
+          <m:t>n</m:t>
+        </m:r>
+      </m:oMath>
+      <w:r>
+        <w:t xml:space="preserve"> </w:t>
+      </w:r>
+      <w:r>
+        <w:t xml:space="preserve">er antallet af grupper, der har målt på den:</w:t>
+      </w:r>
+    </w:p>
+    <w:p>
+      <w:pPr>
+        <w:pStyle w:val="FirstParagraph"/>
+      </w:pPr>
+      <m:oMathPara>
+        <m:oMathParaPr>
+          <m:jc m:val="center"/>
+        </m:oMathParaPr>
+        <m:oMath>
+          <m:acc>
+            <m:accPr>
+              <m:chr m:val="‾"/>
+            </m:accPr>
+            <m:e>
+              <m:r>
+                <m:t>ρ</m:t>
+              </m:r>
+            </m:e>
+          </m:acc>
+          <m:r>
+            <m:rPr>
+              <m:sty m:val="p"/>
+            </m:rPr>
+            <m:t>=</m:t>
+          </m:r>
+          <m:f>
+            <m:fPr>
+              <m:type m:val="bar"/>
+            </m:fPr>
+            <m:num>
+              <m:sSub>
+                <m:e>
+                  <m:r>
+                    <m:t>ρ</m:t>
+                  </m:r>
+                </m:e>
+                <m:sub>
+                  <m:r>
+                    <m:t>1</m:t>
+                  </m:r>
+                </m:sub>
+              </m:sSub>
+              <m:r>
+                <m:rPr>
+                  <m:sty m:val="p"/>
+                </m:rPr>
+                <m:t>+</m:t>
+              </m:r>
+              <m:sSub>
+                <m:e>
+                  <m:r>
+                    <m:t>ρ</m:t>
+                  </m:r>
+                </m:e>
+                <m:sub>
+                  <m:r>
+                    <m:t>2</m:t>
+                  </m:r>
+                </m:sub>
+              </m:sSub>
+              <m:r>
+                <m:rPr>
+                  <m:sty m:val="p"/>
+                </m:rPr>
+                <m:t>+</m:t>
+              </m:r>
+              <m:r>
+                <m:rPr>
+                  <m:sty m:val="p"/>
+                </m:rPr>
+                <m:t>…</m:t>
+              </m:r>
+              <m:r>
+                <m:rPr>
+                  <m:sty m:val="p"/>
+                </m:rPr>
+                <m:t>+</m:t>
+              </m:r>
+              <m:sSub>
+                <m:e>
+                  <m:r>
+                    <m:t>ρ</m:t>
+                  </m:r>
+                </m:e>
+                <m:sub>
+                  <m:r>
+                    <m:t>n</m:t>
+                  </m:r>
+                </m:sub>
+              </m:sSub>
+            </m:num>
+            <m:den>
+              <m:r>
+                <m:t>n</m:t>
+              </m:r>
+            </m:den>
+          </m:f>
+        </m:oMath>
+      </m:oMathPara>
     </w:p>
     <w:tbl>
       <w:tblPr>
@@ -1871,7 +1709,673 @@
       <w:tr>
         <w:tc>
           <w:tcPr/>
-          <w:bookmarkStart w:id="41" w:name="fig-profil"/>
+          <w:bookmarkStart w:id="37" w:name="tbl-3"/>
+          <w:p>
+            <w:pPr>
+              <w:jc w:val="center"/>
+            </w:pPr>
+            <w:pPr>
+              <w:jc w:val="left"/>
+              <w:spacing w:before="200"/>
+              <w:pStyle w:val="ImageCaption"/>
+            </w:pPr>
+            <w:r>
+              <w:t xml:space="preserve">Tabel 3: Hele klassens målte densiteter.</w:t>
+            </w:r>
+          </w:p>
+          <w:tbl>
+            <w:tblPr>
+              <w:tblStyle w:val="Table"/>
+              <w:tblW w:type="pct" w:w="5000"/>
+              <w:tblLayout w:type="fixed"/>
+              <w:tblLook w:firstRow="1" w:lastRow="0" w:firstColumn="0" w:lastColumn="0" w:noHBand="0" w:noVBand="0" w:val="0020"/>
+            </w:tblPr>
+            <w:tblGrid>
+              <w:gridCol w:w="1584"/>
+              <w:gridCol w:w="1584"/>
+              <w:gridCol w:w="1584"/>
+              <w:gridCol w:w="1584"/>
+              <w:gridCol w:w="1584"/>
+            </w:tblGrid>
+            <w:tr>
+              <w:trPr>
+                <w:cantSplit/>
+                <w:tblHeader w:val="on"/>
+              </w:trPr>
+              <w:tc>
+                <w:tcPr/>
+                <w:p>
+                  <w:pPr>
+                    <w:pStyle w:val="Compact"/>
+                    <w:keepNext/>
+                    <w:jc w:val="center"/>
+                    <w:jc w:val="center"/>
+                  </w:pPr>
+                  <w:r>
+                    <w:t xml:space="preserve">Gruppe</w:t>
+                  </w:r>
+                </w:p>
+              </w:tc>
+              <w:tc>
+                <w:tcPr/>
+                <w:p>
+                  <w:pPr>
+                    <w:pStyle w:val="Compact"/>
+                    <w:keepNext/>
+                    <w:jc w:val="center"/>
+                    <w:jc w:val="center"/>
+                  </w:pPr>
+                  <w:r>
+                    <w:t xml:space="preserve">Granit (g/cm³)</w:t>
+                  </w:r>
+                </w:p>
+              </w:tc>
+              <w:tc>
+                <w:tcPr/>
+                <w:p>
+                  <w:pPr>
+                    <w:pStyle w:val="Compact"/>
+                    <w:keepNext/>
+                    <w:jc w:val="center"/>
+                    <w:jc w:val="center"/>
+                  </w:pPr>
+                  <w:r>
+                    <w:t xml:space="preserve">Basalt (g/cm³)</w:t>
+                  </w:r>
+                </w:p>
+              </w:tc>
+              <w:tc>
+                <w:tcPr/>
+                <w:p>
+                  <w:pPr>
+                    <w:pStyle w:val="Compact"/>
+                    <w:keepNext/>
+                    <w:jc w:val="center"/>
+                    <w:jc w:val="center"/>
+                  </w:pPr>
+                  <w:r>
+                    <w:t xml:space="preserve">Peridotit (g/cm³)</w:t>
+                  </w:r>
+                </w:p>
+              </w:tc>
+              <w:tc>
+                <w:tcPr/>
+                <w:p>
+                  <w:pPr>
+                    <w:pStyle w:val="Compact"/>
+                    <w:keepNext/>
+                    <w:jc w:val="center"/>
+                    <w:jc w:val="center"/>
+                  </w:pPr>
+                  <w:r>
+                    <w:t xml:space="preserve">Eklogit (g/cm³)</w:t>
+                  </w:r>
+                </w:p>
+              </w:tc>
+            </w:tr>
+            <w:tr>
+              <w:trPr>
+                <w:cantSplit/>
+              </w:trPr>
+              <w:tc>
+                <w:tcPr/>
+                <w:p>
+                  <w:pPr>
+                    <w:pStyle w:val="Compact"/>
+                    <w:keepNext/>
+                    <w:jc w:val="center"/>
+                    <w:jc w:val="center"/>
+                  </w:pPr>
+                  <w:r>
+                    <w:t xml:space="preserve">1</w:t>
+                  </w:r>
+                </w:p>
+              </w:tc>
+              <w:tc>
+                <w:tcPr/>
+                <w:p>
+                  <w:pPr>
+                    <w:pStyle w:val="Compact"/>
+                    <w:keepNext/>
+                  </w:pPr>
+                </w:p>
+              </w:tc>
+              <w:tc>
+                <w:tcPr/>
+                <w:p>
+                  <w:pPr>
+                    <w:pStyle w:val="Compact"/>
+                    <w:keepNext/>
+                  </w:pPr>
+                </w:p>
+              </w:tc>
+              <w:tc>
+                <w:tcPr/>
+                <w:p>
+                  <w:pPr>
+                    <w:pStyle w:val="Compact"/>
+                    <w:keepNext/>
+                  </w:pPr>
+                </w:p>
+              </w:tc>
+              <w:tc>
+                <w:tcPr/>
+                <w:p>
+                  <w:pPr>
+                    <w:pStyle w:val="Compact"/>
+                    <w:keepNext/>
+                  </w:pPr>
+                </w:p>
+              </w:tc>
+            </w:tr>
+            <w:tr>
+              <w:trPr>
+                <w:cantSplit/>
+              </w:trPr>
+              <w:tc>
+                <w:tcPr/>
+                <w:p>
+                  <w:pPr>
+                    <w:pStyle w:val="Compact"/>
+                    <w:keepNext/>
+                    <w:jc w:val="center"/>
+                    <w:jc w:val="center"/>
+                  </w:pPr>
+                  <w:r>
+                    <w:t xml:space="preserve">2</w:t>
+                  </w:r>
+                </w:p>
+              </w:tc>
+              <w:tc>
+                <w:tcPr/>
+                <w:p>
+                  <w:pPr>
+                    <w:pStyle w:val="Compact"/>
+                    <w:keepNext/>
+                  </w:pPr>
+                </w:p>
+              </w:tc>
+              <w:tc>
+                <w:tcPr/>
+                <w:p>
+                  <w:pPr>
+                    <w:pStyle w:val="Compact"/>
+                    <w:keepNext/>
+                  </w:pPr>
+                </w:p>
+              </w:tc>
+              <w:tc>
+                <w:tcPr/>
+                <w:p>
+                  <w:pPr>
+                    <w:pStyle w:val="Compact"/>
+                    <w:keepNext/>
+                  </w:pPr>
+                </w:p>
+              </w:tc>
+              <w:tc>
+                <w:tcPr/>
+                <w:p>
+                  <w:pPr>
+                    <w:pStyle w:val="Compact"/>
+                    <w:keepNext/>
+                  </w:pPr>
+                </w:p>
+              </w:tc>
+            </w:tr>
+            <w:tr>
+              <w:trPr>
+                <w:cantSplit/>
+              </w:trPr>
+              <w:tc>
+                <w:tcPr/>
+                <w:p>
+                  <w:pPr>
+                    <w:pStyle w:val="Compact"/>
+                    <w:keepNext/>
+                    <w:jc w:val="center"/>
+                    <w:jc w:val="center"/>
+                  </w:pPr>
+                  <w:r>
+                    <w:t xml:space="preserve">3</w:t>
+                  </w:r>
+                </w:p>
+              </w:tc>
+              <w:tc>
+                <w:tcPr/>
+                <w:p>
+                  <w:pPr>
+                    <w:pStyle w:val="Compact"/>
+                    <w:keepNext/>
+                  </w:pPr>
+                </w:p>
+              </w:tc>
+              <w:tc>
+                <w:tcPr/>
+                <w:p>
+                  <w:pPr>
+                    <w:pStyle w:val="Compact"/>
+                    <w:keepNext/>
+                  </w:pPr>
+                </w:p>
+              </w:tc>
+              <w:tc>
+                <w:tcPr/>
+                <w:p>
+                  <w:pPr>
+                    <w:pStyle w:val="Compact"/>
+                    <w:keepNext/>
+                  </w:pPr>
+                </w:p>
+              </w:tc>
+              <w:tc>
+                <w:tcPr/>
+                <w:p>
+                  <w:pPr>
+                    <w:pStyle w:val="Compact"/>
+                    <w:keepNext/>
+                  </w:pPr>
+                </w:p>
+              </w:tc>
+            </w:tr>
+            <w:tr>
+              <w:trPr>
+                <w:cantSplit/>
+              </w:trPr>
+              <w:tc>
+                <w:tcPr/>
+                <w:p>
+                  <w:pPr>
+                    <w:pStyle w:val="Compact"/>
+                    <w:keepNext/>
+                    <w:jc w:val="center"/>
+                    <w:jc w:val="center"/>
+                  </w:pPr>
+                  <w:r>
+                    <w:t xml:space="preserve">4</w:t>
+                  </w:r>
+                </w:p>
+              </w:tc>
+              <w:tc>
+                <w:tcPr/>
+                <w:p>
+                  <w:pPr>
+                    <w:pStyle w:val="Compact"/>
+                    <w:keepNext/>
+                  </w:pPr>
+                </w:p>
+              </w:tc>
+              <w:tc>
+                <w:tcPr/>
+                <w:p>
+                  <w:pPr>
+                    <w:pStyle w:val="Compact"/>
+                    <w:keepNext/>
+                  </w:pPr>
+                </w:p>
+              </w:tc>
+              <w:tc>
+                <w:tcPr/>
+                <w:p>
+                  <w:pPr>
+                    <w:pStyle w:val="Compact"/>
+                    <w:keepNext/>
+                  </w:pPr>
+                </w:p>
+              </w:tc>
+              <w:tc>
+                <w:tcPr/>
+                <w:p>
+                  <w:pPr>
+                    <w:pStyle w:val="Compact"/>
+                    <w:keepNext/>
+                  </w:pPr>
+                </w:p>
+              </w:tc>
+            </w:tr>
+            <w:tr>
+              <w:trPr>
+                <w:cantSplit/>
+              </w:trPr>
+              <w:tc>
+                <w:tcPr/>
+                <w:p>
+                  <w:pPr>
+                    <w:pStyle w:val="Compact"/>
+                    <w:keepNext/>
+                    <w:jc w:val="center"/>
+                    <w:jc w:val="center"/>
+                  </w:pPr>
+                  <w:r>
+                    <w:t xml:space="preserve">5</w:t>
+                  </w:r>
+                </w:p>
+              </w:tc>
+              <w:tc>
+                <w:tcPr/>
+                <w:p>
+                  <w:pPr>
+                    <w:pStyle w:val="Compact"/>
+                    <w:keepNext/>
+                  </w:pPr>
+                </w:p>
+              </w:tc>
+              <w:tc>
+                <w:tcPr/>
+                <w:p>
+                  <w:pPr>
+                    <w:pStyle w:val="Compact"/>
+                    <w:keepNext/>
+                  </w:pPr>
+                </w:p>
+              </w:tc>
+              <w:tc>
+                <w:tcPr/>
+                <w:p>
+                  <w:pPr>
+                    <w:pStyle w:val="Compact"/>
+                    <w:keepNext/>
+                  </w:pPr>
+                </w:p>
+              </w:tc>
+              <w:tc>
+                <w:tcPr/>
+                <w:p>
+                  <w:pPr>
+                    <w:pStyle w:val="Compact"/>
+                    <w:keepNext/>
+                  </w:pPr>
+                </w:p>
+              </w:tc>
+            </w:tr>
+            <w:tr>
+              <w:trPr>
+                <w:cantSplit/>
+              </w:trPr>
+              <w:tc>
+                <w:tcPr/>
+                <w:p>
+                  <w:pPr>
+                    <w:pStyle w:val="Compact"/>
+                    <w:keepNext/>
+                    <w:jc w:val="center"/>
+                    <w:jc w:val="center"/>
+                  </w:pPr>
+                  <w:r>
+                    <w:t xml:space="preserve">6</w:t>
+                  </w:r>
+                </w:p>
+              </w:tc>
+              <w:tc>
+                <w:tcPr/>
+                <w:p>
+                  <w:pPr>
+                    <w:pStyle w:val="Compact"/>
+                    <w:keepNext/>
+                  </w:pPr>
+                </w:p>
+              </w:tc>
+              <w:tc>
+                <w:tcPr/>
+                <w:p>
+                  <w:pPr>
+                    <w:pStyle w:val="Compact"/>
+                    <w:keepNext/>
+                  </w:pPr>
+                </w:p>
+              </w:tc>
+              <w:tc>
+                <w:tcPr/>
+                <w:p>
+                  <w:pPr>
+                    <w:pStyle w:val="Compact"/>
+                    <w:keepNext/>
+                  </w:pPr>
+                </w:p>
+              </w:tc>
+              <w:tc>
+                <w:tcPr/>
+                <w:p>
+                  <w:pPr>
+                    <w:pStyle w:val="Compact"/>
+                    <w:keepNext/>
+                  </w:pPr>
+                </w:p>
+              </w:tc>
+            </w:tr>
+            <w:tr>
+              <w:trPr>
+                <w:cantSplit/>
+              </w:trPr>
+              <w:tc>
+                <w:tcPr/>
+                <w:p>
+                  <w:pPr>
+                    <w:pStyle w:val="Compact"/>
+                    <w:keepNext/>
+                    <w:jc w:val="center"/>
+                    <w:jc w:val="center"/>
+                  </w:pPr>
+                  <w:r>
+                    <w:t xml:space="preserve">7</w:t>
+                  </w:r>
+                </w:p>
+              </w:tc>
+              <w:tc>
+                <w:tcPr/>
+                <w:p>
+                  <w:pPr>
+                    <w:pStyle w:val="Compact"/>
+                    <w:keepNext/>
+                  </w:pPr>
+                </w:p>
+              </w:tc>
+              <w:tc>
+                <w:tcPr/>
+                <w:p>
+                  <w:pPr>
+                    <w:pStyle w:val="Compact"/>
+                    <w:keepNext/>
+                  </w:pPr>
+                </w:p>
+              </w:tc>
+              <w:tc>
+                <w:tcPr/>
+                <w:p>
+                  <w:pPr>
+                    <w:pStyle w:val="Compact"/>
+                    <w:keepNext/>
+                  </w:pPr>
+                </w:p>
+              </w:tc>
+              <w:tc>
+                <w:tcPr/>
+                <w:p>
+                  <w:pPr>
+                    <w:pStyle w:val="Compact"/>
+                    <w:keepNext/>
+                  </w:pPr>
+                </w:p>
+              </w:tc>
+            </w:tr>
+            <w:tr>
+              <w:trPr>
+                <w:cantSplit/>
+              </w:trPr>
+              <w:tc>
+                <w:tcPr/>
+                <w:p>
+                  <w:pPr>
+                    <w:pStyle w:val="Compact"/>
+                    <w:keepNext/>
+                    <w:jc w:val="center"/>
+                    <w:jc w:val="center"/>
+                  </w:pPr>
+                  <w:r>
+                    <w:t xml:space="preserve">8</w:t>
+                  </w:r>
+                </w:p>
+              </w:tc>
+              <w:tc>
+                <w:tcPr/>
+                <w:p>
+                  <w:pPr>
+                    <w:pStyle w:val="Compact"/>
+                    <w:keepNext/>
+                  </w:pPr>
+                </w:p>
+              </w:tc>
+              <w:tc>
+                <w:tcPr/>
+                <w:p>
+                  <w:pPr>
+                    <w:pStyle w:val="Compact"/>
+                    <w:keepNext/>
+                  </w:pPr>
+                </w:p>
+              </w:tc>
+              <w:tc>
+                <w:tcPr/>
+                <w:p>
+                  <w:pPr>
+                    <w:pStyle w:val="Compact"/>
+                    <w:keepNext/>
+                  </w:pPr>
+                </w:p>
+              </w:tc>
+              <w:tc>
+                <w:tcPr/>
+                <w:p>
+                  <w:pPr>
+                    <w:pStyle w:val="Compact"/>
+                    <w:keepNext/>
+                  </w:pPr>
+                </w:p>
+              </w:tc>
+            </w:tr>
+            <w:tr>
+              <w:trPr>
+                <w:cantSplit/>
+              </w:trPr>
+              <w:tc>
+                <w:tcPr/>
+                <w:p>
+                  <w:pPr>
+                    <w:pStyle w:val="Compact"/>
+                    <w:jc w:val="center"/>
+                    <w:jc w:val="center"/>
+                  </w:pPr>
+                  <w:r>
+                    <w:rPr>
+                      <w:b/>
+                      <w:bCs/>
+                    </w:rPr>
+                    <w:t xml:space="preserve">Gennemsnit</w:t>
+                  </w:r>
+                </w:p>
+              </w:tc>
+              <w:tc>
+                <w:tcPr/>
+                <w:p>
+                  <w:pPr>
+                    <w:pStyle w:val="Compact"/>
+                  </w:pPr>
+                </w:p>
+              </w:tc>
+              <w:tc>
+                <w:tcPr/>
+                <w:p>
+                  <w:pPr>
+                    <w:pStyle w:val="Compact"/>
+                  </w:pPr>
+                </w:p>
+              </w:tc>
+              <w:tc>
+                <w:tcPr/>
+                <w:p>
+                  <w:pPr>
+                    <w:pStyle w:val="Compact"/>
+                  </w:pPr>
+                </w:p>
+              </w:tc>
+              <w:tc>
+                <w:tcPr/>
+                <w:p>
+                  <w:pPr>
+                    <w:pStyle w:val="Compact"/>
+                  </w:pPr>
+                </w:p>
+              </w:tc>
+            </w:tr>
+          </w:tbl>
+          <w:bookmarkEnd w:id="37"/>
+          <w:p/>
+        </w:tc>
+      </w:tr>
+    </w:tbl>
+    <w:p>
+      <w:pPr>
+        <w:pStyle w:val="Compact"/>
+        <w:numPr>
+          <w:ilvl w:val="0"/>
+          <w:numId w:val="1007"/>
+        </w:numPr>
+      </w:pPr>
+      <w:r>
+        <w:t xml:space="preserve">Sæt de fire bjergarter i rækkefølge efter klassens gennemsnit, og sammenlign med jeres hypotese.</w:t>
+      </w:r>
+    </w:p>
+    <w:p>
+      <w:pPr>
+        <w:pStyle w:val="Compact"/>
+        <w:numPr>
+          <w:ilvl w:val="0"/>
+          <w:numId w:val="1007"/>
+        </w:numPr>
+      </w:pPr>
+      <w:hyperlink w:anchor="fig-profil">
+        <w:r>
+          <w:rPr>
+            <w:rStyle w:val="Hyperlink"/>
+          </w:rPr>
+          <w:t xml:space="preserve">Figur 2</w:t>
+        </w:r>
+      </w:hyperlink>
+      <w:r>
+        <w:t xml:space="preserve"> </w:t>
+      </w:r>
+      <w:r>
+        <w:t xml:space="preserve">viser et snit fra en midtoceanisk ryg til et kontinent. Find ud af, hvilken bjergart der hører til i hvert af felterne A–D, og udfyld</w:t>
+      </w:r>
+      <w:r>
+        <w:t xml:space="preserve"> </w:t>
+      </w:r>
+      <w:hyperlink w:anchor="tbl-4">
+        <w:r>
+          <w:rPr>
+            <w:rStyle w:val="Hyperlink"/>
+          </w:rPr>
+          <w:t xml:space="preserve">Tabel 4</w:t>
+        </w:r>
+      </w:hyperlink>
+      <w:r>
+        <w:t xml:space="preserve">.</w:t>
+      </w:r>
+    </w:p>
+    <w:tbl>
+      <w:tblPr>
+        <w:tblStyle w:val="Table"/>
+        <w:tblW w:type="pct" w:w="5000"/>
+        <w:tblLayout w:type="fixed"/>
+        <w:tblLook w:firstRow="0" w:lastRow="0" w:firstColumn="0" w:lastColumn="0" w:noHBand="0" w:noVBand="0" w:val="0000"/>
+      </w:tblPr>
+      <w:tblGrid>
+        <w:gridCol w:w="7920"/>
+      </w:tblGrid>
+      <w:tr>
+        <w:tc>
+          <w:tcPr/>
+          <w:bookmarkStart w:id="42" w:name="fig-profil"/>
           <w:p>
             <w:pPr>
               <w:pStyle w:val="Compact"/>
@@ -1880,26 +2384,26 @@
             <w:r>
               <w:drawing>
                 <wp:inline>
-                  <wp:extent cx="6096000" cy="2857500"/>
+                  <wp:extent cx="5364480" cy="2514600"/>
                   <wp:effectExtent b="0" l="0" r="0" t="0"/>
-                  <wp:docPr descr="" title="" id="38" name="Picture"/>
+                  <wp:docPr descr="" title="" id="39" name="Picture"/>
                   <a:graphic>
                     <a:graphicData uri="http://schemas.openxmlformats.org/drawingml/2006/picture">
                       <pic:pic>
                         <pic:nvPicPr>
-                          <pic:cNvPr descr="figurer/profil.svg" id="39" name="Picture"/>
+                          <pic:cNvPr descr="figurer/profil.svg" id="40" name="Picture"/>
                           <pic:cNvPicPr>
                             <a:picLocks noChangeArrowheads="1" noChangeAspect="1"/>
                           </pic:cNvPicPr>
                         </pic:nvPicPr>
                         <pic:blipFill>
-                          <a:blip r:embed="rId40">
+                          <a:blip r:embed="rId41">
                             <a:extLst>
                               <a:ext uri="{28A0092B-C50C-407E-A947-70E740481C1C}">
                                 <ns6:useLocalDpi val="0"/>
                               </a:ext>
                               <a:ext uri="{96DAC541-7B7A-43D3-8B79-37D633B846F1}">
-                                <ns7:svgBlip r:embed="rId37"/>
+                                <ns7:svgBlip r:embed="rId38"/>
                               </a:ext>
                             </a:extLst>
                           </a:blip>
@@ -1910,7 +2414,7 @@
                         <pic:spPr bwMode="auto">
                           <a:xfrm>
                             <a:off x="0" y="0"/>
-                            <a:ext cx="6096000" cy="2857500"/>
+                            <a:ext cx="5364480" cy="2514600"/>
                           </a:xfrm>
                           <a:prstGeom prst="rect">
                             <a:avLst/>
@@ -1942,7 +2446,7 @@
               <w:t xml:space="preserve">Figur 2: Snit fra en midtoceanisk ryg over oceanbunden til en subduktionszone under et kontinent. Pilene viser, hvordan pladerne bevæger sig.</w:t>
             </w:r>
           </w:p>
-          <w:bookmarkEnd w:id="41"/>
+          <w:bookmarkEnd w:id="42"/>
         </w:tc>
       </w:tr>
     </w:tbl>
@@ -1967,7 +2471,7 @@
       <w:tr>
         <w:tc>
           <w:tcPr/>
-          <w:bookmarkStart w:id="42" w:name="tbl-3"/>
+          <w:bookmarkStart w:id="43" w:name="tbl-4"/>
           <w:p>
             <w:pPr>
               <w:jc w:val="center"/>
@@ -1978,7 +2482,7 @@
               <w:pStyle w:val="ImageCaption"/>
             </w:pPr>
             <w:r>
-              <w:t xml:space="preserve">Tabel 3: Bjergarterne placeret i snittet.</w:t>
+              <w:t xml:space="preserve">Tabel 4: Bjergarterne placeret i snittet.</w:t>
             </w:r>
           </w:p>
           <w:tbl>
@@ -2050,7 +2554,7 @@
                     <w:jc w:val="center"/>
                   </w:pPr>
                   <w:r>
-                    <w:t xml:space="preserve">Målt densitet (g/cm³)</w:t>
+                    <w:t xml:space="preserve">Klassens gennemsnit (g/cm³)</w:t>
                   </w:r>
                 </w:p>
               </w:tc>
@@ -2236,13 +2740,13 @@
               </w:tc>
             </w:tr>
           </w:tbl>
-          <w:bookmarkEnd w:id="42"/>
+          <w:bookmarkEnd w:id="43"/>
           <w:p/>
         </w:tc>
       </w:tr>
     </w:tbl>
-    <w:bookmarkEnd w:id="43"/>
-    <w:bookmarkStart w:id="44" w:name="journalspørgsmål"/>
+    <w:bookmarkEnd w:id="44"/>
+    <w:bookmarkStart w:id="45" w:name="journalspørgsmål"/>
     <w:p>
       <w:pPr>
         <w:pStyle w:val="Heading2"/>
@@ -2332,10 +2836,22 @@
         </w:numPr>
       </w:pPr>
       <w:r>
-        <w:t xml:space="preserve">Hvor godt repræsenterer én håndstor sten en hel del af Jorden? Diskutér, hvad der kunne gøre jeres resultat mere sikkert.</w:t>
+        <w:t xml:space="preserve">Sammenlign jeres egne densiteter med klassens gennemsnit. Hvor meget spreder gruppernes resultater, og hvorfor er et gennemsnit af hele klassen mere pålideligt end én gruppes måling?</w:t>
       </w:r>
     </w:p>
-    <w:bookmarkEnd w:id="44"/>
+    <w:p>
+      <w:pPr>
+        <w:pStyle w:val="Compact"/>
+        <w:numPr>
+          <w:ilvl w:val="0"/>
+          <w:numId w:val="1008"/>
+        </w:numPr>
+      </w:pPr>
+      <w:r>
+        <w:t xml:space="preserve">Hvor godt repræsenterer én håndstor sten en hel del af Jorden? Diskutér, hvad der kunne gøre resultatet endnu mere sikkert.</w:t>
+      </w:r>
+    </w:p>
+    <w:bookmarkEnd w:id="45"/>
     <w:sectPr>
       <w:headerReference r:id="rId7" w:type="default"/>
       <w:footerReference r:id="rId8" w:type="default"/>

</xml_diff>

<commit_message>
Bjergarters densitet: fjern journalspørgsmål om vægtens visning og om fejlkilder
Co-Authored-By: Claude Opus 5.5 <noreply@anthropic.com>
</commit_message>
<xml_diff>
--- a/Øvelser/Geografi/bjergarters-densitet/bjergarters-densitet.docx
+++ b/Øvelser/Geografi/bjergarters-densitet/bjergarters-densitet.docx
@@ -336,7 +336,7 @@
                     <a:graphicData uri="http://schemas.openxmlformats.org/drawingml/2006/picture">
                       <pic:pic>
                         <pic:nvPicPr>
-                          <pic:cNvPr descr="/tmp/claude-0/-home-user-smbi/7d291b92-c289-57a9-b4b8-12c4134f11be/scratchpad/qo/quarto-1.10.18/share/formats/docx/note.png" id="28" name="Picture"/>
+                          <pic:cNvPr descr="/Applications/quarto/share/formats/docx/note.png" id="28" name="Picture"/>
                           <pic:cNvPicPr>
                             <a:picLocks noChangeArrowheads="1" noChangeAspect="1"/>
                           </pic:cNvPicPr>
@@ -651,7 +651,7 @@
                     <a:graphicData uri="http://schemas.openxmlformats.org/drawingml/2006/picture">
                       <pic:pic>
                         <pic:nvPicPr>
-                          <pic:cNvPr descr="/tmp/claude-0/-home-user-smbi/7d291b92-c289-57a9-b4b8-12c4134f11be/scratchpad/qo/quarto-1.10.18/share/formats/docx/tip.png" id="32" name="Picture"/>
+                          <pic:cNvPr descr="/Applications/quarto/share/formats/docx/tip.png" id="32" name="Picture"/>
                           <pic:cNvPicPr>
                             <a:picLocks noChangeArrowheads="1" noChangeAspect="1"/>
                           </pic:cNvPicPr>
@@ -2144,7 +2144,7 @@
         </w:numPr>
       </w:pPr>
       <w:r>
-        <w:t xml:space="preserve">Forklar med egne ord, hvorfor vægten viser massen af det fortrængte vand og ikke stenens masse, når stenen hænger i snoren. Hvad ville vægten vise, hvis stenen lå på bunden af skålen?</w:t>
+        <w:t xml:space="preserve">Brug jeres målte densiteter til at forklare, hvorfor det altid er oceanbundspladen og aldrig kontinentet, der bliver presset ned i en subduktionszone.</w:t>
       </w:r>
     </w:p>
     <w:p>
@@ -2156,7 +2156,7 @@
         </w:numPr>
       </w:pPr>
       <w:r>
-        <w:t xml:space="preserve">Brug jeres målte densiteter til at forklare, hvorfor det altid er oceanbundspladen og aldrig kontinentet, der bliver presset ned i en subduktionszone.</w:t>
+        <w:t xml:space="preserve">Basalten omdannes til eklogit, når den oceaniske plade er nået ned i dybden. Sammenlign eklogittens densitet med kappens (peridotittens). Hvad betyder forskellen for, om pladen synker videre af sig selv, og hvilken rolle spiller det som drivkraft for pladebevægelserne?</w:t>
       </w:r>
     </w:p>
     <w:p>
@@ -2168,7 +2168,7 @@
         </w:numPr>
       </w:pPr>
       <w:r>
-        <w:t xml:space="preserve">Basalten omdannes til eklogit, når den oceaniske plade er nået ned i dybden. Sammenlign eklogittens densitet med kappens (peridotittens). Hvad betyder forskellen for, om pladen synker videre af sig selv, og hvilken rolle spiller det som drivkraft for pladebevægelserne?</w:t>
+        <w:t xml:space="preserve">De ældste bjergarter på kontinenterne er omkring 4 milliarder år gamle, mens den ældste oceanbund er under 200 millioner år gammel. Forklar forskellen ud fra jeres resultater.</w:t>
       </w:r>
     </w:p>
     <w:p>
@@ -2180,31 +2180,7 @@
         </w:numPr>
       </w:pPr>
       <w:r>
-        <w:t xml:space="preserve">De ældste bjergarter på kontinenterne er omkring 4 milliarder år gamle, mens den ældste oceanbund er under 200 millioner år gammel. Forklar forskellen ud fra jeres resultater.</w:t>
-      </w:r>
-    </w:p>
-    <w:p>
-      <w:pPr>
-        <w:pStyle w:val="Compact"/>
-        <w:numPr>
-          <w:ilvl w:val="0"/>
-          <w:numId w:val="1008"/>
-        </w:numPr>
-      </w:pPr>
-      <w:r>
         <w:t xml:space="preserve">Kontinenterne ligger over havniveau, og oceanbunden ligger flere kilometer under. Hvordan kan forskellen i densitet være med til at forklare det?</w:t>
-      </w:r>
-    </w:p>
-    <w:p>
-      <w:pPr>
-        <w:pStyle w:val="Compact"/>
-        <w:numPr>
-          <w:ilvl w:val="0"/>
-          <w:numId w:val="1008"/>
-        </w:numPr>
-      </w:pPr>
-      <w:r>
-        <w:t xml:space="preserve">Vurdér jeres fejlkilder. Hvilke af dem giver for stor en densitet, og hvilke giver for lille? Tænk fx på luftbobler, en porøs sten, der suger vand, snoren og vægtens opløsning.</w:t>
       </w:r>
     </w:p>
     <w:p>

</xml_diff>